<commit_message>
Fix attendance tracking logic in pipeline.py
</commit_message>
<xml_diff>
--- a/Output/Final_MoM_Document.docx
+++ b/Output/Final_MoM_Document.docx
@@ -302,7 +302,7 @@
               <w:rPr>
                 <w:rFonts w:ascii="Arial" w:hAnsi="Arial" w:cs="Arial"/>
               </w:rPr>
-              <w:t xml:space="preserve">nan</w:t>
+              <w:t xml:space="preserve">JOHN DOE</w:t>
             </w:r>
           </w:p>
         </w:tc>
@@ -320,7 +320,7 @@
               <w:rPr>
                 <w:rFonts w:ascii="Arial" w:hAnsi="Arial" w:cs="Arial"/>
               </w:rPr>
-              <w:t xml:space="preserve">External / Unknown</w:t>
+              <w:t xml:space="preserve">Manager</w:t>
             </w:r>
           </w:p>
         </w:tc>
@@ -338,7 +338,7 @@
               <w:rPr>
                 <w:rFonts w:ascii="Arial" w:hAnsi="Arial" w:cs="Arial"/>
               </w:rPr>
-              <w:t xml:space="preserve">EXT</w:t>
+              <w:t xml:space="preserve">JD</w:t>
             </w:r>
           </w:p>
         </w:tc>
@@ -394,7 +394,7 @@
               <w:rPr>
                 <w:rFonts w:ascii="Arial" w:hAnsi="Arial" w:cs="Arial"/>
               </w:rPr>
-              <w:t xml:space="preserve">3. In-Meeting Activities</w:t>
+              <w:t xml:space="preserve">ELLIE SMITH</w:t>
             </w:r>
           </w:p>
         </w:tc>
@@ -412,7 +412,7 @@
               <w:rPr>
                 <w:rFonts w:ascii="Arial" w:hAnsi="Arial" w:cs="Arial"/>
               </w:rPr>
-              <w:t xml:space="preserve">External / Unknown</w:t>
+              <w:t xml:space="preserve">Developer</w:t>
             </w:r>
           </w:p>
         </w:tc>
@@ -430,559 +430,7 @@
               <w:rPr>
                 <w:rFonts w:ascii="Arial" w:hAnsi="Arial" w:cs="Arial"/>
               </w:rPr>
-              <w:t xml:space="preserve">EXT</w:t>
-            </w:r>
-          </w:p>
-        </w:tc>
-        <w:tc>
-          <w:tcPr>
-            <w:tcW w:w="1815" w:type="dxa"/>
-          </w:tcPr>
-          <w:p>
-            <w:pPr>
-              <w:rPr>
-                <w:rFonts w:ascii="Arial" w:hAnsi="Arial" w:cs="Arial"/>
-              </w:rPr>
-            </w:pPr>
-            <w:r>
-              <w:rPr>
-                <w:rFonts w:ascii="Arial" w:hAnsi="Arial" w:cs="Arial"/>
-              </w:rPr>
-              <w:t xml:space="preserve">Y </w:t>
-            </w:r>
-          </w:p>
-        </w:tc>
-      </w:tr>
-      <w:tr>
-        <w:tc>
-          <w:tcPr>
-            <w:tcW w:w="1796" w:type="dxa"/>
-          </w:tcPr>
-          <w:p>
-            <w:pPr>
-              <w:rPr>
-                <w:rFonts w:ascii="Arial" w:hAnsi="Arial" w:cs="Arial"/>
-              </w:rPr>
-            </w:pPr>
-            <w:r>
-              <w:rPr>
-                <w:rFonts w:ascii="Arial" w:hAnsi="Arial" w:cs="Arial"/>
-              </w:rPr>
-              <w:t xml:space="preserve">4</w:t>
-            </w:r>
-          </w:p>
-        </w:tc>
-        <w:tc>
-          <w:tcPr>
-            <w:tcW w:w="1722" w:type="dxa"/>
-          </w:tcPr>
-          <w:p>
-            <w:pPr>
-              <w:rPr>
-                <w:rFonts w:ascii="Arial" w:hAnsi="Arial" w:cs="Arial"/>
-              </w:rPr>
-            </w:pPr>
-            <w:r>
-              <w:rPr>
-                <w:rFonts w:ascii="Arial" w:hAnsi="Arial" w:cs="Arial"/>
-              </w:rPr>
-              <w:t xml:space="preserve">Name</w:t>
-            </w:r>
-          </w:p>
-        </w:tc>
-        <w:tc>
-          <w:tcPr>
-            <w:tcW w:w="1978" w:type="dxa"/>
-          </w:tcPr>
-          <w:p>
-            <w:pPr>
-              <w:rPr>
-                <w:rFonts w:ascii="Arial" w:hAnsi="Arial" w:cs="Arial"/>
-              </w:rPr>
-            </w:pPr>
-            <w:r>
-              <w:rPr>
-                <w:rFonts w:ascii="Arial" w:hAnsi="Arial" w:cs="Arial"/>
-              </w:rPr>
-              <w:t xml:space="preserve">External / Unknown</w:t>
-            </w:r>
-          </w:p>
-        </w:tc>
-        <w:tc>
-          <w:tcPr>
-            <w:tcW w:w="2039" w:type="dxa"/>
-          </w:tcPr>
-          <w:p>
-            <w:pPr>
-              <w:rPr>
-                <w:rFonts w:ascii="Arial" w:hAnsi="Arial" w:cs="Arial"/>
-              </w:rPr>
-            </w:pPr>
-            <w:r>
-              <w:rPr>
-                <w:rFonts w:ascii="Arial" w:hAnsi="Arial" w:cs="Arial"/>
-              </w:rPr>
-              <w:t xml:space="preserve">EXT</w:t>
-            </w:r>
-          </w:p>
-        </w:tc>
-        <w:tc>
-          <w:tcPr>
-            <w:tcW w:w="1815" w:type="dxa"/>
-          </w:tcPr>
-          <w:p>
-            <w:pPr>
-              <w:rPr>
-                <w:rFonts w:ascii="Arial" w:hAnsi="Arial" w:cs="Arial"/>
-              </w:rPr>
-            </w:pPr>
-            <w:r>
-              <w:rPr>
-                <w:rFonts w:ascii="Arial" w:hAnsi="Arial" w:cs="Arial"/>
-              </w:rPr>
-              <w:t xml:space="preserve">Y </w:t>
-            </w:r>
-          </w:p>
-        </w:tc>
-      </w:tr>
-      <w:tr>
-        <w:tc>
-          <w:tcPr>
-            <w:tcW w:w="1796" w:type="dxa"/>
-          </w:tcPr>
-          <w:p>
-            <w:pPr>
-              <w:rPr>
-                <w:rFonts w:ascii="Arial" w:hAnsi="Arial" w:cs="Arial"/>
-              </w:rPr>
-            </w:pPr>
-            <w:r>
-              <w:rPr>
-                <w:rFonts w:ascii="Arial" w:hAnsi="Arial" w:cs="Arial"/>
-              </w:rPr>
-              <w:t xml:space="preserve">5</w:t>
-            </w:r>
-          </w:p>
-        </w:tc>
-        <w:tc>
-          <w:tcPr>
-            <w:tcW w:w="1722" w:type="dxa"/>
-          </w:tcPr>
-          <w:p>
-            <w:pPr>
-              <w:rPr>
-                <w:rFonts w:ascii="Arial" w:hAnsi="Arial" w:cs="Arial"/>
-              </w:rPr>
-            </w:pPr>
-            <w:r>
-              <w:rPr>
-                <w:rFonts w:ascii="Arial" w:hAnsi="Arial" w:cs="Arial"/>
-              </w:rPr>
-              <w:t xml:space="preserve">MARK GRAHAM</w:t>
-            </w:r>
-          </w:p>
-        </w:tc>
-        <w:tc>
-          <w:tcPr>
-            <w:tcW w:w="1978" w:type="dxa"/>
-          </w:tcPr>
-          <w:p>
-            <w:pPr>
-              <w:rPr>
-                <w:rFonts w:ascii="Arial" w:hAnsi="Arial" w:cs="Arial"/>
-              </w:rPr>
-            </w:pPr>
-            <w:r>
-              <w:rPr>
-                <w:rFonts w:ascii="Arial" w:hAnsi="Arial" w:cs="Arial"/>
-              </w:rPr>
-              <w:t xml:space="preserve">Equity Markets</w:t>
-            </w:r>
-          </w:p>
-        </w:tc>
-        <w:tc>
-          <w:tcPr>
-            <w:tcW w:w="2039" w:type="dxa"/>
-          </w:tcPr>
-          <w:p>
-            <w:pPr>
-              <w:rPr>
-                <w:rFonts w:ascii="Arial" w:hAnsi="Arial" w:cs="Arial"/>
-              </w:rPr>
-            </w:pPr>
-            <w:r>
-              <w:rPr>
-                <w:rFonts w:ascii="Arial" w:hAnsi="Arial" w:cs="Arial"/>
-              </w:rPr>
-              <w:t xml:space="preserve">MG</w:t>
-            </w:r>
-          </w:p>
-        </w:tc>
-        <w:tc>
-          <w:tcPr>
-            <w:tcW w:w="1815" w:type="dxa"/>
-          </w:tcPr>
-          <w:p>
-            <w:pPr>
-              <w:rPr>
-                <w:rFonts w:ascii="Arial" w:hAnsi="Arial" w:cs="Arial"/>
-              </w:rPr>
-            </w:pPr>
-            <w:r>
-              <w:rPr>
-                <w:rFonts w:ascii="Arial" w:hAnsi="Arial" w:cs="Arial"/>
-              </w:rPr>
-              <w:t xml:space="preserve">Y </w:t>
-            </w:r>
-          </w:p>
-        </w:tc>
-      </w:tr>
-      <w:tr>
-        <w:tc>
-          <w:tcPr>
-            <w:tcW w:w="1796" w:type="dxa"/>
-          </w:tcPr>
-          <w:p>
-            <w:pPr>
-              <w:rPr>
-                <w:rFonts w:ascii="Arial" w:hAnsi="Arial" w:cs="Arial"/>
-              </w:rPr>
-            </w:pPr>
-            <w:r>
-              <w:rPr>
-                <w:rFonts w:ascii="Arial" w:hAnsi="Arial" w:cs="Arial"/>
-              </w:rPr>
-              <w:t xml:space="preserve">6</w:t>
-            </w:r>
-          </w:p>
-        </w:tc>
-        <w:tc>
-          <w:tcPr>
-            <w:tcW w:w="1722" w:type="dxa"/>
-          </w:tcPr>
-          <w:p>
-            <w:pPr>
-              <w:rPr>
-                <w:rFonts w:ascii="Arial" w:hAnsi="Arial" w:cs="Arial"/>
-              </w:rPr>
-            </w:pPr>
-            <w:r>
-              <w:rPr>
-                <w:rFonts w:ascii="Arial" w:hAnsi="Arial" w:cs="Arial"/>
-              </w:rPr>
-              <w:t xml:space="preserve">nan</w:t>
-            </w:r>
-          </w:p>
-        </w:tc>
-        <w:tc>
-          <w:tcPr>
-            <w:tcW w:w="1978" w:type="dxa"/>
-          </w:tcPr>
-          <w:p>
-            <w:pPr>
-              <w:rPr>
-                <w:rFonts w:ascii="Arial" w:hAnsi="Arial" w:cs="Arial"/>
-              </w:rPr>
-            </w:pPr>
-            <w:r>
-              <w:rPr>
-                <w:rFonts w:ascii="Arial" w:hAnsi="Arial" w:cs="Arial"/>
-              </w:rPr>
-              <w:t xml:space="preserve">External / Unknown</w:t>
-            </w:r>
-          </w:p>
-        </w:tc>
-        <w:tc>
-          <w:tcPr>
-            <w:tcW w:w="2039" w:type="dxa"/>
-          </w:tcPr>
-          <w:p>
-            <w:pPr>
-              <w:rPr>
-                <w:rFonts w:ascii="Arial" w:hAnsi="Arial" w:cs="Arial"/>
-              </w:rPr>
-            </w:pPr>
-            <w:r>
-              <w:rPr>
-                <w:rFonts w:ascii="Arial" w:hAnsi="Arial" w:cs="Arial"/>
-              </w:rPr>
-              <w:t xml:space="preserve">EXT</w:t>
-            </w:r>
-          </w:p>
-        </w:tc>
-        <w:tc>
-          <w:tcPr>
-            <w:tcW w:w="1815" w:type="dxa"/>
-          </w:tcPr>
-          <w:p>
-            <w:pPr>
-              <w:rPr>
-                <w:rFonts w:ascii="Arial" w:hAnsi="Arial" w:cs="Arial"/>
-              </w:rPr>
-            </w:pPr>
-            <w:r>
-              <w:rPr>
-                <w:rFonts w:ascii="Arial" w:hAnsi="Arial" w:cs="Arial"/>
-              </w:rPr>
-              <w:t xml:space="preserve">Y </w:t>
-            </w:r>
-          </w:p>
-        </w:tc>
-      </w:tr>
-      <w:tr>
-        <w:tc>
-          <w:tcPr>
-            <w:tcW w:w="1796" w:type="dxa"/>
-          </w:tcPr>
-          <w:p>
-            <w:pPr>
-              <w:rPr>
-                <w:rFonts w:ascii="Arial" w:hAnsi="Arial" w:cs="Arial"/>
-              </w:rPr>
-            </w:pPr>
-            <w:r>
-              <w:rPr>
-                <w:rFonts w:ascii="Arial" w:hAnsi="Arial" w:cs="Arial"/>
-              </w:rPr>
-              <w:t xml:space="preserve">7</w:t>
-            </w:r>
-          </w:p>
-        </w:tc>
-        <w:tc>
-          <w:tcPr>
-            <w:tcW w:w="1722" w:type="dxa"/>
-          </w:tcPr>
-          <w:p>
-            <w:pPr>
-              <w:rPr>
-                <w:rFonts w:ascii="Arial" w:hAnsi="Arial" w:cs="Arial"/>
-              </w:rPr>
-            </w:pPr>
-            <w:r>
-              <w:rPr>
-                <w:rFonts w:ascii="Arial" w:hAnsi="Arial" w:cs="Arial"/>
-              </w:rPr>
-              <w:t xml:space="preserve">4. Explicit Audio and Video Consent Information</w:t>
-            </w:r>
-          </w:p>
-        </w:tc>
-        <w:tc>
-          <w:tcPr>
-            <w:tcW w:w="1978" w:type="dxa"/>
-          </w:tcPr>
-          <w:p>
-            <w:pPr>
-              <w:rPr>
-                <w:rFonts w:ascii="Arial" w:hAnsi="Arial" w:cs="Arial"/>
-              </w:rPr>
-            </w:pPr>
-            <w:r>
-              <w:rPr>
-                <w:rFonts w:ascii="Arial" w:hAnsi="Arial" w:cs="Arial"/>
-              </w:rPr>
-              <w:t xml:space="preserve">External / Unknown</w:t>
-            </w:r>
-          </w:p>
-        </w:tc>
-        <w:tc>
-          <w:tcPr>
-            <w:tcW w:w="2039" w:type="dxa"/>
-          </w:tcPr>
-          <w:p>
-            <w:pPr>
-              <w:rPr>
-                <w:rFonts w:ascii="Arial" w:hAnsi="Arial" w:cs="Arial"/>
-              </w:rPr>
-            </w:pPr>
-            <w:r>
-              <w:rPr>
-                <w:rFonts w:ascii="Arial" w:hAnsi="Arial" w:cs="Arial"/>
-              </w:rPr>
-              <w:t xml:space="preserve">EXT</w:t>
-            </w:r>
-          </w:p>
-        </w:tc>
-        <w:tc>
-          <w:tcPr>
-            <w:tcW w:w="1815" w:type="dxa"/>
-          </w:tcPr>
-          <w:p>
-            <w:pPr>
-              <w:rPr>
-                <w:rFonts w:ascii="Arial" w:hAnsi="Arial" w:cs="Arial"/>
-              </w:rPr>
-            </w:pPr>
-            <w:r>
-              <w:rPr>
-                <w:rFonts w:ascii="Arial" w:hAnsi="Arial" w:cs="Arial"/>
-              </w:rPr>
-              <w:t xml:space="preserve">Y </w:t>
-            </w:r>
-          </w:p>
-        </w:tc>
-      </w:tr>
-      <w:tr>
-        <w:tc>
-          <w:tcPr>
-            <w:tcW w:w="1796" w:type="dxa"/>
-          </w:tcPr>
-          <w:p>
-            <w:pPr>
-              <w:rPr>
-                <w:rFonts w:ascii="Arial" w:hAnsi="Arial" w:cs="Arial"/>
-              </w:rPr>
-            </w:pPr>
-            <w:r>
-              <w:rPr>
-                <w:rFonts w:ascii="Arial" w:hAnsi="Arial" w:cs="Arial"/>
-              </w:rPr>
-              <w:t xml:space="preserve">8</w:t>
-            </w:r>
-          </w:p>
-        </w:tc>
-        <w:tc>
-          <w:tcPr>
-            <w:tcW w:w="1722" w:type="dxa"/>
-          </w:tcPr>
-          <w:p>
-            <w:pPr>
-              <w:rPr>
-                <w:rFonts w:ascii="Arial" w:hAnsi="Arial" w:cs="Arial"/>
-              </w:rPr>
-            </w:pPr>
-            <w:r>
-              <w:rPr>
-                <w:rFonts w:ascii="Arial" w:hAnsi="Arial" w:cs="Arial"/>
-              </w:rPr>
-              <w:t xml:space="preserve">Name</w:t>
-            </w:r>
-          </w:p>
-        </w:tc>
-        <w:tc>
-          <w:tcPr>
-            <w:tcW w:w="1978" w:type="dxa"/>
-          </w:tcPr>
-          <w:p>
-            <w:pPr>
-              <w:rPr>
-                <w:rFonts w:ascii="Arial" w:hAnsi="Arial" w:cs="Arial"/>
-              </w:rPr>
-            </w:pPr>
-            <w:r>
-              <w:rPr>
-                <w:rFonts w:ascii="Arial" w:hAnsi="Arial" w:cs="Arial"/>
-              </w:rPr>
-              <w:t xml:space="preserve">External / Unknown</w:t>
-            </w:r>
-          </w:p>
-        </w:tc>
-        <w:tc>
-          <w:tcPr>
-            <w:tcW w:w="2039" w:type="dxa"/>
-          </w:tcPr>
-          <w:p>
-            <w:pPr>
-              <w:rPr>
-                <w:rFonts w:ascii="Arial" w:hAnsi="Arial" w:cs="Arial"/>
-              </w:rPr>
-            </w:pPr>
-            <w:r>
-              <w:rPr>
-                <w:rFonts w:ascii="Arial" w:hAnsi="Arial" w:cs="Arial"/>
-              </w:rPr>
-              <w:t xml:space="preserve">EXT</w:t>
-            </w:r>
-          </w:p>
-        </w:tc>
-        <w:tc>
-          <w:tcPr>
-            <w:tcW w:w="1815" w:type="dxa"/>
-          </w:tcPr>
-          <w:p>
-            <w:pPr>
-              <w:rPr>
-                <w:rFonts w:ascii="Arial" w:hAnsi="Arial" w:cs="Arial"/>
-              </w:rPr>
-            </w:pPr>
-            <w:r>
-              <w:rPr>
-                <w:rFonts w:ascii="Arial" w:hAnsi="Arial" w:cs="Arial"/>
-              </w:rPr>
-              <w:t xml:space="preserve">Y </w:t>
-            </w:r>
-          </w:p>
-        </w:tc>
-      </w:tr>
-      <w:tr>
-        <w:tc>
-          <w:tcPr>
-            <w:tcW w:w="1796" w:type="dxa"/>
-          </w:tcPr>
-          <w:p>
-            <w:pPr>
-              <w:rPr>
-                <w:rFonts w:ascii="Arial" w:hAnsi="Arial" w:cs="Arial"/>
-              </w:rPr>
-            </w:pPr>
-            <w:r>
-              <w:rPr>
-                <w:rFonts w:ascii="Arial" w:hAnsi="Arial" w:cs="Arial"/>
-              </w:rPr>
-              <w:t xml:space="preserve">9</w:t>
-            </w:r>
-          </w:p>
-        </w:tc>
-        <w:tc>
-          <w:tcPr>
-            <w:tcW w:w="1722" w:type="dxa"/>
-          </w:tcPr>
-          <w:p>
-            <w:pPr>
-              <w:rPr>
-                <w:rFonts w:ascii="Arial" w:hAnsi="Arial" w:cs="Arial"/>
-              </w:rPr>
-            </w:pPr>
-            <w:r>
-              <w:rPr>
-                <w:rFonts w:ascii="Arial" w:hAnsi="Arial" w:cs="Arial"/>
-              </w:rPr>
-              <w:t xml:space="preserve">MARK GRAHAM</w:t>
-            </w:r>
-          </w:p>
-        </w:tc>
-        <w:tc>
-          <w:tcPr>
-            <w:tcW w:w="1978" w:type="dxa"/>
-          </w:tcPr>
-          <w:p>
-            <w:pPr>
-              <w:rPr>
-                <w:rFonts w:ascii="Arial" w:hAnsi="Arial" w:cs="Arial"/>
-              </w:rPr>
-            </w:pPr>
-            <w:r>
-              <w:rPr>
-                <w:rFonts w:ascii="Arial" w:hAnsi="Arial" w:cs="Arial"/>
-              </w:rPr>
-              <w:t xml:space="preserve">External / Unknown</w:t>
-            </w:r>
-          </w:p>
-        </w:tc>
-        <w:tc>
-          <w:tcPr>
-            <w:tcW w:w="2039" w:type="dxa"/>
-          </w:tcPr>
-          <w:p>
-            <w:pPr>
-              <w:rPr>
-                <w:rFonts w:ascii="Arial" w:hAnsi="Arial" w:cs="Arial"/>
-              </w:rPr>
-            </w:pPr>
-            <w:r>
-              <w:rPr>
-                <w:rFonts w:ascii="Arial" w:hAnsi="Arial" w:cs="Arial"/>
-              </w:rPr>
-              <w:t xml:space="preserve">EXT</w:t>
+              <w:t xml:space="preserve">ES</w:t>
             </w:r>
           </w:p>
         </w:tc>
@@ -1040,7 +488,7 @@
         <w:rPr>
           <w:rFonts w:ascii="Arial" w:hAnsi="Arial" w:cs="Arial"/>
         </w:rPr>
-        <w:t xml:space="preserve">NAME welcomes everyone to the ABC Update Committee DEF 5.</w:t>
+        <w:t xml:space="preserve">Mark Graham welcomes everyone to the ABC Update Committee DEF 5.</w:t>
       </w:r>
     </w:p>
     <w:p>

</xml_diff>